<commit_message>
Set single author details on menstrual health paper
Replace the two-column placeholder author block with Rohini Garje,
Symbiosis Institute of Computer Science and Research, Pune, and switch
plural author wording ("we", "the authors") to single-author phrasing.

Co-Authored-By: Claude Opus 5.5 <noreply@anthropic.com>
Claude-Session: https://claude.ai/code/session_01ACCsxawZBVGME8BvVrkQQa
</commit_message>
<xml_diff>
--- a/research/menstrual-health-hygiene/Menstrual_Health_and_Hygiene_IEEE_Paper.docx
+++ b/research/menstrual-health-hygiene/Menstrual_Health_and_Hygiene_IEEE_Paper.docx
@@ -31,175 +31,54 @@
         <w:t xml:space="preserve"/>
       </w:r>
     </w:p>
-    <w:tbl>
-      <w:tblPr>
-        <w:tblW w:type="dxa" w:w="10440"/>
-        <w:tblBorders>
-          <w:top w:val="none" w:color="FFFFFF" w:sz="0"/>
-          <w:left w:val="none" w:color="FFFFFF" w:sz="0"/>
-          <w:bottom w:val="none" w:color="FFFFFF" w:sz="0"/>
-          <w:right w:val="none" w:color="FFFFFF" w:sz="0"/>
-          <w:insideH w:val="none" w:color="FFFFFF" w:sz="0"/>
-          <w:insideV w:val="none" w:color="FFFFFF" w:sz="0"/>
-        </w:tblBorders>
-        <w:tblLayout w:type="fixed"/>
-      </w:tblPr>
-      <w:tblGrid>
-        <w:gridCol w:w="5220"/>
-        <w:gridCol w:w="5220"/>
-      </w:tblGrid>
-      <w:tr>
-        <w:trPr>
-          <w:cantSplit/>
-        </w:trPr>
-        <w:tc>
-          <w:tcPr>
-            <w:tcW w:type="dxa" w:w="5220"/>
-            <w:tcBorders>
-              <w:top w:val="none" w:color="FFFFFF" w:sz="0"/>
-              <w:left w:val="none" w:color="FFFFFF" w:sz="0"/>
-              <w:bottom w:val="none" w:color="FFFFFF" w:sz="0"/>
-              <w:right w:val="none" w:color="FFFFFF" w:sz="0"/>
-            </w:tcBorders>
-            <w:vAlign w:val="center"/>
-          </w:tcPr>
-          <w:p>
-            <w:pPr>
-              <w:spacing w:after="60"/>
-              <w:jc w:val="center"/>
-            </w:pPr>
-            <w:r>
-              <w:rPr>
-                <w:sz w:val="22"/>
-                <w:szCs w:val="22"/>
-              </w:rPr>
-              <w:t xml:space="preserve">[First Author] and [Second Author]</w:t>
-            </w:r>
-          </w:p>
-          <w:p>
-            <w:pPr>
-              <w:spacing/>
-              <w:jc w:val="center"/>
-            </w:pPr>
-            <w:r>
-              <w:rPr>
-                <w:i/>
-                <w:iCs/>
-              </w:rPr>
-              <w:t xml:space="preserve">[Department of Public Health]</w:t>
-            </w:r>
-          </w:p>
-          <w:p>
-            <w:pPr>
-              <w:spacing/>
-              <w:jc w:val="center"/>
-            </w:pPr>
-            <w:r>
-              <w:rPr>
-                <w:i/>
-                <w:iCs/>
-              </w:rPr>
-              <w:t xml:space="preserve">[Name of University]</w:t>
-            </w:r>
-          </w:p>
-          <w:p>
-            <w:pPr>
-              <w:spacing/>
-              <w:jc w:val="center"/>
-            </w:pPr>
-            <w:r>
-              <w:rPr>
-                <w:i/>
-                <w:iCs/>
-              </w:rPr>
-              <w:t xml:space="preserve">[City, State, Country]</w:t>
-            </w:r>
-          </w:p>
-          <w:p>
-            <w:pPr>
-              <w:spacing w:before="60"/>
-              <w:jc w:val="center"/>
-            </w:pPr>
-            <w:r>
-              <w:t xml:space="preserve">{first.author, second.author}@university.edu</w:t>
-            </w:r>
-          </w:p>
-        </w:tc>
-        <w:tc>
-          <w:tcPr>
-            <w:tcW w:type="dxa" w:w="5220"/>
-            <w:tcBorders>
-              <w:top w:val="none" w:color="FFFFFF" w:sz="0"/>
-              <w:left w:val="none" w:color="FFFFFF" w:sz="0"/>
-              <w:bottom w:val="none" w:color="FFFFFF" w:sz="0"/>
-              <w:right w:val="none" w:color="FFFFFF" w:sz="0"/>
-            </w:tcBorders>
-            <w:vAlign w:val="center"/>
-          </w:tcPr>
-          <w:p>
-            <w:pPr>
-              <w:spacing w:after="60"/>
-              <w:jc w:val="center"/>
-            </w:pPr>
-            <w:r>
-              <w:rPr>
-                <w:sz w:val="22"/>
-                <w:szCs w:val="22"/>
-              </w:rPr>
-              <w:t xml:space="preserve">[Third Author]</w:t>
-            </w:r>
-          </w:p>
-          <w:p>
-            <w:pPr>
-              <w:spacing/>
-              <w:jc w:val="center"/>
-            </w:pPr>
-            <w:r>
-              <w:rPr>
-                <w:i/>
-                <w:iCs/>
-              </w:rPr>
-              <w:t xml:space="preserve">[Department of Biomedical Engineering]</w:t>
-            </w:r>
-          </w:p>
-          <w:p>
-            <w:pPr>
-              <w:spacing/>
-              <w:jc w:val="center"/>
-            </w:pPr>
-            <w:r>
-              <w:rPr>
-                <w:i/>
-                <w:iCs/>
-              </w:rPr>
-              <w:t xml:space="preserve">[Name of University]</w:t>
-            </w:r>
-          </w:p>
-          <w:p>
-            <w:pPr>
-              <w:spacing/>
-              <w:jc w:val="center"/>
-            </w:pPr>
-            <w:r>
-              <w:rPr>
-                <w:i/>
-                <w:iCs/>
-              </w:rPr>
-              <w:t xml:space="preserve">[City, State, Country]</w:t>
-            </w:r>
-          </w:p>
-          <w:p>
-            <w:pPr>
-              <w:spacing w:before="60"/>
-              <w:jc w:val="center"/>
-            </w:pPr>
-            <w:r>
-              <w:t xml:space="preserve">third.author@university.edu</w:t>
-            </w:r>
-          </w:p>
-        </w:tc>
-      </w:tr>
-    </w:tbl>
+    <w:p>
+      <w:pPr>
+        <w:spacing w:after="60"/>
+        <w:jc w:val="center"/>
+      </w:pPr>
+      <w:r>
+        <w:rPr>
+          <w:sz w:val="22"/>
+          <w:szCs w:val="22"/>
+        </w:rPr>
+        <w:t xml:space="preserve">Rohini Garje</w:t>
+      </w:r>
+    </w:p>
+    <w:p>
+      <w:pPr>
+        <w:spacing/>
+        <w:jc w:val="center"/>
+      </w:pPr>
+      <w:r>
+        <w:rPr>
+          <w:i/>
+          <w:iCs/>
+        </w:rPr>
+        <w:t xml:space="preserve">Symbiosis Institute of Computer Science and Research</w:t>
+      </w:r>
+    </w:p>
+    <w:p>
+      <w:pPr>
+        <w:spacing/>
+        <w:jc w:val="center"/>
+      </w:pPr>
+      <w:r>
+        <w:rPr>
+          <w:i/>
+          <w:iCs/>
+        </w:rPr>
+        <w:t xml:space="preserve">Pune, Maharashtra, India</w:t>
+      </w:r>
+    </w:p>
+    <w:p>
+      <w:pPr>
+        <w:spacing w:before="60"/>
+        <w:jc w:val="center"/>
+      </w:pPr>
+      <w:r>
+        <w:t xml:space="preserve">rog2424132@sicsr.ac.in</w:t>
+      </w:r>
+    </w:p>
     <w:p>
       <w:r>
         <w:rPr>
@@ -245,7 +124,7 @@
           <w:sz w:val="18"/>
           <w:szCs w:val="18"/>
         </w:rPr>
-        <w:t xml:space="preserve"> - Menstruation is a normal biological process experienced every month by about 1.8 billion people, yet inadequate access to menstrual materials, water, sanitation and hygiene (WASH), accurate information and supportive social environments continues to undermine health, education and dignity. This paper reviews the current state of menstrual health and hygiene (MHH) and analyses publicly available secondary data from the WHO/UNICEF Joint Monitoring Programme (JMP) and two rounds of India’s National Family Health Survey (NFHS-4, 2015–16, and NFHS-5, 2019–21). Globally, one in four people lacked a basic handwashing facility at home in 2022, and in 2023 only 39% of schools provided menstrual health education and 31% had bins for menstrual waste. In India, the share of women aged 15–24 using hygienic methods of menstrual protection rose from 57.6% to 77.3%, but a 16.8-percentage-point urban–rural gap persists and use is strongly graded by schooling and household wealth. A simple life-cycle model indicates that one user of disposable products discards close to 10,000 units over a lifetime, compared with four menstrual cups. We synthesize evidence on health, psychosocial, educational and environmental outcomes, map barriers onto a socio-ecological framework and propose integrated recommendations spanning education, product access, school infrastructure, health services, waste management and policy.</w:t>
+        <w:t xml:space="preserve"> - Menstruation is a normal biological process experienced every month by about 1.8 billion people, yet inadequate access to menstrual materials, water, sanitation and hygiene (WASH), accurate information and supportive social environments continues to undermine health, education and dignity. This paper reviews the current state of menstrual health and hygiene (MHH) and analyses publicly available secondary data from the WHO/UNICEF Joint Monitoring Programme (JMP) and two rounds of India’s National Family Health Survey (NFHS-4, 2015–16, and NFHS-5, 2019–21). Globally, one in four people lacked a basic handwashing facility at home in 2022, and in 2023 only 39% of schools provided menstrual health education and 31% had bins for menstrual waste. In India, the share of women aged 15–24 using hygienic methods of menstrual protection rose from 57.6% to 77.3%, but a 16.8-percentage-point urban–rural gap persists and use is strongly graded by schooling and household wealth. A simple life-cycle model indicates that one user of disposable products discards close to 10,000 units over a lifetime, compared with four menstrual cups. The paper also synthesizes evidence on health, psychosocial, educational and environmental outcomes, maps barriers onto a socio-ecological framework and proposes integrated recommendations spanning education, product access, school infrastructure, health services, waste management and policy.</w:t>
       </w:r>
     </w:p>
     <w:p>
@@ -364,7 +243,7 @@
         <w:t xml:space="preserve">1) Conceptual synthesis</w:t>
       </w:r>
       <w:r>
-        <w:t xml:space="preserve">: We trace the shift from menstrual hygiene management (MHM) to the broader concept of menstrual health and summarize the components and indicators now used for monitoring.</w:t>
+        <w:t xml:space="preserve">: The paper traces the shift from menstrual hygiene management (MHM) to the broader concept of menstrual health and summarizes the components and indicators now used for monitoring.</w:t>
       </w:r>
     </w:p>
     <w:p>
@@ -380,7 +259,7 @@
         <w:t xml:space="preserve">2) Secondary data analysis</w:t>
       </w:r>
       <w:r>
-        <w:t xml:space="preserve">: We analyse global estimates from the WHO/UNICEF Joint Monitoring Programme (JMP) and two rounds of India’s National Family Health Survey (NFHS) to describe levels, trends and inequalities in MHH.</w:t>
+        <w:t xml:space="preserve">: The paper analyses global estimates from the WHO/UNICEF Joint Monitoring Programme (JMP) and two rounds of India’s National Family Health Survey (NFHS) to describe levels, trends and inequalities in MHH.</w:t>
       </w:r>
     </w:p>
     <w:p>
@@ -396,7 +275,7 @@
         <w:t xml:space="preserve">3) Environmental estimate</w:t>
       </w:r>
       <w:r>
-        <w:t xml:space="preserve">: We introduce a transparent life-cycle model of the number of menstrual products used per person to compare disposable and reusable options.</w:t>
+        <w:t xml:space="preserve">: The paper introduces a transparent life-cycle model of the number of menstrual products used per person to compare disposable and reusable options.</w:t>
       </w:r>
     </w:p>
     <w:p>
@@ -412,7 +291,7 @@
         <w:t xml:space="preserve">4) Recommendations</w:t>
       </w:r>
       <w:r>
-        <w:t xml:space="preserve">: We map barriers onto a socio-ecological framework and propose evidence-informed actions for policy and practice.</w:t>
+        <w:t xml:space="preserve">: The paper maps barriers onto a socio-ecological framework and proposes evidence-informed actions for policy and practice.</w:t>
       </w:r>
     </w:p>
     <w:p>
@@ -1146,7 +1025,7 @@
         <w:jc w:val="both"/>
       </w:pPr>
       <w:r>
-        <w:t xml:space="preserve">Indicators are reported as percentages. Change between survey rounds is expressed in percentage points (pp), and inequality is expressed both as an absolute gap between two groups and as a relative ratio. To compare menstrual products, we estimate the number of units one person uses over a menstruating lifetime. For single-use products,</w:t>
+        <w:t xml:space="preserve">Indicators are reported as percentages. Change between survey rounds is expressed in percentage points (pp), and inequality is expressed both as an absolute gap between two groups and as a relative ratio. To compare menstrual products, the number of units one person uses over a menstruating lifetime is estimated. For single-use products,</w:t>
       </w:r>
     </w:p>
     <w:p>
@@ -4433,7 +4312,7 @@
         <w:jc w:val="both"/>
       </w:pPr>
       <w:r>
-        <w:t xml:space="preserve">Based on the evidence reviewed, we propose six priority actions.</w:t>
+        <w:t xml:space="preserve">Based on the evidence reviewed, six priority actions are proposed.</w:t>
       </w:r>
     </w:p>
     <w:p>
@@ -4600,7 +4479,7 @@
         <w:jc w:val="both"/>
       </w:pPr>
       <w:r>
-        <w:t xml:space="preserve">The authors thank the International Institute for Population Sciences, Mumbai, and the WHO/UNICEF Joint Monitoring Programme for making the survey data used in this study publicly available.</w:t>
+        <w:t xml:space="preserve">The author thanks the International Institute for Population Sciences, Mumbai, and the WHO/UNICEF Joint Monitoring Programme for making the survey data used in this study publicly available.</w:t>
       </w:r>
     </w:p>
     <w:p>

</xml_diff>